<commit_message>
e71ab78272a96c14a3ffbaee7e5ec970d6b7944e deploy: siteground artifact
</commit_message>
<xml_diff>
--- a/hub/manuals/nrms-editor.docx
+++ b/hub/manuals/nrms-editor.docx
@@ -6499,7 +6499,27 @@
         </w:numPr>
       </w:pPr>
       <w:r>
-        <w:t xml:space="preserve">its release number or URL key, such as 2026HLTH0003-000008;</w:t>
+        <w:t xml:space="preserve">its key, such as 2026HLTH0003-000008 (shown as </w:t>
+      </w:r>
+      <w:r>
+        <w:rPr>
+          <w:b/>
+          <w:bCs/>
+        </w:rPr>
+        <w:t xml:space="preserve">Key</w:t>
+      </w:r>
+      <w:r>
+        <w:t xml:space="preserve"> under </w:t>
+      </w:r>
+      <w:r>
+        <w:rPr>
+          <w:b/>
+          <w:bCs/>
+        </w:rPr>
+        <w:t xml:space="preserve">Release info</w:t>
+      </w:r>
+      <w:r>
+        <w:t xml:space="preserve">);</w:t>
       </w:r>
     </w:p>
     <w:p>
@@ -6693,7 +6713,7 @@
         <w:spacing w:after="120"/>
       </w:pPr>
       <w:r>
-        <w:t xml:space="preserve">Typing a reference number, release number or web address here opens the release directly, as </w:t>
+        <w:t xml:space="preserve">Typing a reference number, key or web address here opens the release directly, as </w:t>
       </w:r>
       <w:r>
         <w:rPr>
@@ -6765,7 +6785,7 @@
         <w:spacing w:after="120"/>
       </w:pPr>
       <w:r>
-        <w:t xml:space="preserve">To find the releases linked to a Calendar activity, search for its reference with a ministry prefix, such as HLTH-123. If no release is linked to it, or you can't see that activity in the Calendar, you also get the releases with those words in the headline, so COVID-19 finds headlines that mention COVID-19.</w:t>
+        <w:t xml:space="preserve">A reference such as HLTH-123 also finds the releases linked to that Calendar activity. Anything that looks like this, such as COVID-19, is also searched for in headlines. The headlines are left out only when it names an activity you can see in the Calendar that has releases linked to it.</w:t>
       </w:r>
     </w:p>
     <w:p>

</xml_diff>

<commit_message>
0676fe86311287dc4de1aef9806d020454986100 deploy: siteground artifact
</commit_message>
<xml_diff>
--- a/hub/manuals/nrms-editor.docx
+++ b/hub/manuals/nrms-editor.docx
@@ -76,7 +76,7 @@
           <w:sz w:val="24"/>
           <w:szCs w:val="24"/>
         </w:rPr>
-        <w:t xml:space="preserve">Software version of October 30, 2026</w:t>
+        <w:t xml:space="preserve">Software version of October 31, 2026</w:t>
       </w:r>
     </w:p>
     <w:p>
@@ -1427,7 +1427,17 @@
         <w:spacing w:after="120"/>
       </w:pPr>
       <w:r>
-        <w:t xml:space="preserve">Choose </w:t>
+        <w:t xml:space="preserve">Each activity shows its planned time and its </w:t>
+      </w:r>
+      <w:r>
+        <w:rPr>
+          <w:b/>
+          <w:bCs/>
+        </w:rPr>
+        <w:t xml:space="preserve">Calendar activity ID</w:t>
+      </w:r>
+      <w:r>
+        <w:t xml:space="preserve">. Choose </w:t>
       </w:r>
       <w:r>
         <w:rPr>
@@ -1594,7 +1604,7 @@
         <w:t xml:space="preserve">Page title</w:t>
       </w:r>
       <w:r>
-        <w:t xml:space="preserve">, such as </w:t>
+        <w:t xml:space="preserve"> (required), such as </w:t>
       </w:r>
       <w:r>
         <w:rPr>
@@ -1666,7 +1676,17 @@
         <w:t xml:space="preserve">Formal</w:t>
       </w:r>
       <w:r>
-        <w:t xml:space="preserve"> or </w:t>
+        <w:t xml:space="preserve"> documents have an </w:t>
+      </w:r>
+      <w:r>
+        <w:rPr>
+          <w:b/>
+          <w:bCs/>
+        </w:rPr>
+        <w:t xml:space="preserve">Organizations</w:t>
+      </w:r>
+      <w:r>
+        <w:t xml:space="preserve"> line, </w:t>
       </w:r>
       <w:r>
         <w:rPr>
@@ -1676,6 +1696,16 @@
         <w:t xml:space="preserve">Informal</w:t>
       </w:r>
       <w:r>
+        <w:t xml:space="preserve"> ones a </w:t>
+      </w:r>
+      <w:r>
+        <w:rPr>
+          <w:b/>
+          <w:bCs/>
+        </w:rPr>
+        <w:t xml:space="preserve">Byline</w:t>
+      </w:r>
+      <w:r>
         <w:t xml:space="preserve">.</w:t>
       </w:r>
     </w:p>
@@ -1749,7 +1779,7 @@
           <w:b/>
           <w:bCs/>
         </w:rPr>
-        <w:t xml:space="preserve">Activity ID</w:t>
+        <w:t xml:space="preserve">Calendar activity ID</w:t>
       </w:r>
       <w:r>
         <w:t xml:space="preserve">. See below.</w:t>
@@ -1803,10 +1833,10 @@
           <w:b/>
           <w:bCs/>
         </w:rPr>
-        <w:t xml:space="preserve">Lead ministry</w:t>
-      </w:r>
-      <w:r>
-        <w:t xml:space="preserve">.</w:t>
+        <w:t xml:space="preserve">Lead ministry (needed before approving)</w:t>
+      </w:r>
+      <w:r>
+        <w:t xml:space="preserve">. An advisory doesn't need one.</w:t>
       </w:r>
     </w:p>
     <w:p>
@@ -1870,7 +1900,17 @@
         <w:t xml:space="preserve">Media distribution lists</w:t>
       </w:r>
       <w:r>
-        <w:t xml:space="preserve"> the release should go to. An advisory must have at least one before it can be published.</w:t>
+        <w:t xml:space="preserve"> the release should go to. For an advisory the heading reads </w:t>
+      </w:r>
+      <w:r>
+        <w:rPr>
+          <w:b/>
+          <w:bCs/>
+        </w:rPr>
+        <w:t xml:space="preserve">Media distribution lists (needed before publishing)</w:t>
+      </w:r>
+      <w:r>
+        <w:t xml:space="preserve">: you can create it without one.</w:t>
       </w:r>
     </w:p>
     <w:p>
@@ -2334,7 +2374,7 @@
           <w:b/>
           <w:bCs/>
         </w:rPr>
-        <w:t xml:space="preserve">Activity ID</w:t>
+        <w:t xml:space="preserve">Calendar activity ID</w:t>
       </w:r>
       <w:r>
         <w:t xml:space="preserve">. The activity's title, ministry and start appear under the field, and its "Translations required", if any.</w:t>
@@ -2359,7 +2399,7 @@
         <w:t xml:space="preserve">Fill in from activity 3</w:t>
       </w:r>
       <w:r>
-        <w:t xml:space="preserve"> (the button names the number) to copy its start (as the planned publish date), its city (as the location), its lead and shared ministries, sectors, themes and tags. Check them before you create the release.</w:t>
+        <w:t xml:space="preserve"> (the button names the number) to copy its start (as the planned publish date), its city (as the location), its lead and shared ministries, sectors, themes and tags. Check them before you create the release. The planned publish date shows as a line, such as "Planned publish date: Jun 11, 2031 10:00 AM, from the activity. You can change it in Publish settings once the release is created."</w:t>
       </w:r>
     </w:p>
     <w:p>
@@ -2543,7 +2583,17 @@
         <w:spacing w:after="120"/>
       </w:pPr>
       <w:r>
-        <w:t xml:space="preserve">At the top of a release you see its type, status, reference number and headline. Below that, under "Before this can be approved:" and "Before this can be published:", is what is still missing.</w:t>
+        <w:t xml:space="preserve">At the top of a release you see its type, status, reference number and headline. If something is still missing, a line such as "Not ready: 2 things to fix." follows. Choose </w:t>
+      </w:r>
+      <w:r>
+        <w:rPr>
+          <w:b/>
+          <w:bCs/>
+        </w:rPr>
+        <w:t xml:space="preserve">See them under Actions</w:t>
+      </w:r>
+      <w:r>
+        <w:t xml:space="preserve"> to go to the list, where each item links to the part to fix.</w:t>
       </w:r>
     </w:p>
     <w:p>
@@ -2824,7 +2874,79 @@
         <w:spacing w:after="120"/>
       </w:pPr>
       <w:r>
-        <w:t xml:space="preserve">Each document has a </w:t>
+        <w:t xml:space="preserve">Each document says its layout under its heading, such as "Layout: Formal". The layout decides one field:</w:t>
+      </w:r>
+    </w:p>
+    <w:p>
+      <w:pPr>
+        <w:pStyle w:val="ListParagraph"/>
+        <w:numPr>
+          <w:ilvl w:val="0"/>
+          <w:numId w:val="1"/>
+        </w:numPr>
+      </w:pPr>
+      <w:r>
+        <w:t xml:space="preserve">A </w:t>
+      </w:r>
+      <w:r>
+        <w:rPr>
+          <w:b/>
+          <w:bCs/>
+        </w:rPr>
+        <w:t xml:space="preserve">Formal</w:t>
+      </w:r>
+      <w:r>
+        <w:t xml:space="preserve"> document has </w:t>
+      </w:r>
+      <w:r>
+        <w:rPr>
+          <w:b/>
+          <w:bCs/>
+        </w:rPr>
+        <w:t xml:space="preserve">Organizations</w:t>
+      </w:r>
+      <w:r>
+        <w:t xml:space="preserve">, marked "Needed before publishing." on a release, story or factsheet.</w:t>
+      </w:r>
+    </w:p>
+    <w:p>
+      <w:pPr>
+        <w:pStyle w:val="ListParagraph"/>
+        <w:numPr>
+          <w:ilvl w:val="0"/>
+          <w:numId w:val="1"/>
+        </w:numPr>
+      </w:pPr>
+      <w:r>
+        <w:t xml:space="preserve">An </w:t>
+      </w:r>
+      <w:r>
+        <w:rPr>
+          <w:b/>
+          <w:bCs/>
+        </w:rPr>
+        <w:t xml:space="preserve">Informal</w:t>
+      </w:r>
+      <w:r>
+        <w:t xml:space="preserve"> document has a </w:t>
+      </w:r>
+      <w:r>
+        <w:rPr>
+          <w:b/>
+          <w:bCs/>
+        </w:rPr>
+        <w:t xml:space="preserve">Byline</w:t>
+      </w:r>
+      <w:r>
+        <w:t xml:space="preserve"> instead.</w:t>
+      </w:r>
+    </w:p>
+    <w:p>
+      <w:pPr>
+        <w:spacing w:after="120"/>
+      </w:pPr>
+      <w:r>
+        <w:t xml:space="preserve">Every document also has a </w:t>
       </w:r>
       <w:r>
         <w:rPr>
@@ -2841,7 +2963,7 @@
           <w:b/>
           <w:bCs/>
         </w:rPr>
-        <w:t xml:space="preserve">Organizations</w:t>
+        <w:t xml:space="preserve">Headline</w:t>
       </w:r>
       <w:r>
         <w:t xml:space="preserve">, </w:t>
@@ -2851,7 +2973,7 @@
           <w:b/>
           <w:bCs/>
         </w:rPr>
-        <w:t xml:space="preserve">Headline</w:t>
+        <w:t xml:space="preserve">Subheadline</w:t>
       </w:r>
       <w:r>
         <w:t xml:space="preserve">, </w:t>
@@ -2861,7 +2983,53 @@
           <w:b/>
           <w:bCs/>
         </w:rPr>
-        <w:t xml:space="preserve">Subheadline</w:t>
+        <w:t xml:space="preserve">Body</w:t>
+      </w:r>
+      <w:r>
+        <w:t xml:space="preserve"> and </w:t>
+      </w:r>
+      <w:r>
+        <w:rPr>
+          <w:b/>
+          <w:bCs/>
+        </w:rPr>
+        <w:t xml:space="preserve">Contacts</w:t>
+      </w:r>
+      <w:r>
+        <w:t xml:space="preserve">.</w:t>
+      </w:r>
+    </w:p>
+    <w:p>
+      <w:pPr>
+        <w:spacing w:after="120"/>
+      </w:pPr>
+      <w:r>
+        <w:t xml:space="preserve">If a document already holds a byline but is Formal, or organizations but is Informal, that text shows, but can't be edited, with a note such as "A formal document doesn't keep a byline. It's removed the next time this tab is saved." Copy it first if you need it.</w:t>
+      </w:r>
+    </w:p>
+    <w:p>
+      <w:pPr>
+        <w:spacing w:after="120"/>
+      </w:pPr>
+      <w:r>
+        <w:t xml:space="preserve">The </w:t>
+      </w:r>
+      <w:r>
+        <w:rPr>
+          <w:b/>
+          <w:bCs/>
+        </w:rPr>
+        <w:t xml:space="preserve">Body</w:t>
+      </w:r>
+      <w:r>
+        <w:t xml:space="preserve"> toolbar has </w:t>
+      </w:r>
+      <w:r>
+        <w:rPr>
+          <w:b/>
+          <w:bCs/>
+        </w:rPr>
+        <w:t xml:space="preserve">Bold</w:t>
       </w:r>
       <w:r>
         <w:t xml:space="preserve">, </w:t>
@@ -2871,7 +3039,7 @@
           <w:b/>
           <w:bCs/>
         </w:rPr>
-        <w:t xml:space="preserve">Byline</w:t>
+        <w:t xml:space="preserve">Italic</w:t>
       </w:r>
       <w:r>
         <w:t xml:space="preserve">, </w:t>
@@ -2881,7 +3049,27 @@
           <w:b/>
           <w:bCs/>
         </w:rPr>
-        <w:t xml:space="preserve">Body</w:t>
+        <w:t xml:space="preserve">Bulleted list</w:t>
+      </w:r>
+      <w:r>
+        <w:t xml:space="preserve">, </w:t>
+      </w:r>
+      <w:r>
+        <w:rPr>
+          <w:b/>
+          <w:bCs/>
+        </w:rPr>
+        <w:t xml:space="preserve">Numbered list</w:t>
+      </w:r>
+      <w:r>
+        <w:t xml:space="preserve">, </w:t>
+      </w:r>
+      <w:r>
+        <w:rPr>
+          <w:b/>
+          <w:bCs/>
+        </w:rPr>
+        <w:t xml:space="preserve">Link</w:t>
       </w:r>
       <w:r>
         <w:t xml:space="preserve"> and </w:t>
@@ -2891,104 +3079,6 @@
           <w:b/>
           <w:bCs/>
         </w:rPr>
-        <w:t xml:space="preserve">Contacts</w:t>
-      </w:r>
-      <w:r>
-        <w:t xml:space="preserve">. With the </w:t>
-      </w:r>
-      <w:r>
-        <w:rPr>
-          <w:b/>
-          <w:bCs/>
-        </w:rPr>
-        <w:t xml:space="preserve">Formal</w:t>
-      </w:r>
-      <w:r>
-        <w:t xml:space="preserve"> layout, </w:t>
-      </w:r>
-      <w:r>
-        <w:rPr>
-          <w:b/>
-          <w:bCs/>
-        </w:rPr>
-        <w:t xml:space="preserve">Organizations</w:t>
-      </w:r>
-      <w:r>
-        <w:t xml:space="preserve"> must be filled in before you can publish.</w:t>
-      </w:r>
-    </w:p>
-    <w:p>
-      <w:pPr>
-        <w:spacing w:after="120"/>
-      </w:pPr>
-      <w:r>
-        <w:t xml:space="preserve">The </w:t>
-      </w:r>
-      <w:r>
-        <w:rPr>
-          <w:b/>
-          <w:bCs/>
-        </w:rPr>
-        <w:t xml:space="preserve">Body</w:t>
-      </w:r>
-      <w:r>
-        <w:t xml:space="preserve"> toolbar has </w:t>
-      </w:r>
-      <w:r>
-        <w:rPr>
-          <w:b/>
-          <w:bCs/>
-        </w:rPr>
-        <w:t xml:space="preserve">Bold</w:t>
-      </w:r>
-      <w:r>
-        <w:t xml:space="preserve">, </w:t>
-      </w:r>
-      <w:r>
-        <w:rPr>
-          <w:b/>
-          <w:bCs/>
-        </w:rPr>
-        <w:t xml:space="preserve">Italic</w:t>
-      </w:r>
-      <w:r>
-        <w:t xml:space="preserve">, </w:t>
-      </w:r>
-      <w:r>
-        <w:rPr>
-          <w:b/>
-          <w:bCs/>
-        </w:rPr>
-        <w:t xml:space="preserve">Bulleted list</w:t>
-      </w:r>
-      <w:r>
-        <w:t xml:space="preserve">, </w:t>
-      </w:r>
-      <w:r>
-        <w:rPr>
-          <w:b/>
-          <w:bCs/>
-        </w:rPr>
-        <w:t xml:space="preserve">Numbered list</w:t>
-      </w:r>
-      <w:r>
-        <w:t xml:space="preserve">, </w:t>
-      </w:r>
-      <w:r>
-        <w:rPr>
-          <w:b/>
-          <w:bCs/>
-        </w:rPr>
-        <w:t xml:space="preserve">Link</w:t>
-      </w:r>
-      <w:r>
-        <w:t xml:space="preserve"> and </w:t>
-      </w:r>
-      <w:r>
-        <w:rPr>
-          <w:b/>
-          <w:bCs/>
-        </w:rPr>
         <w:t xml:space="preserve">Insert asset</w:t>
       </w:r>
       <w:r>
@@ -3259,7 +3349,7 @@
         <w:t xml:space="preserve">French</w:t>
       </w:r>
       <w:r>
-        <w:t xml:space="preserve"> tab and fill it in. Once the French tab exists, its headline, body and organizations must be filled in before you can publish.</w:t>
+        <w:t xml:space="preserve"> tab and fill it in. Once the French tab exists, its headline and body, and on a Formal document its organizations, must be filled in before you can publish.</w:t>
       </w:r>
     </w:p>
     <w:p>
@@ -3401,7 +3491,7 @@
         <w:t xml:space="preserve">Summary</w:t>
       </w:r>
       <w:r>
-        <w:t xml:space="preserve">: what subscribers see in their email. It fills itself from the start of the body, and </w:t>
+        <w:t xml:space="preserve">: what subscribers see in their email. It fills itself from the start of the body. </w:t>
       </w:r>
       <w:r>
         <w:rPr>
@@ -3411,7 +3501,17 @@
         <w:t xml:space="preserve">Documents</w:t>
       </w:r>
       <w:r>
-        <w:t xml:space="preserve"> shows "(auto)" until you change it.</w:t>
+        <w:t xml:space="preserve"> shows it, with "(auto)" until you change it, and an </w:t>
+      </w:r>
+      <w:r>
+        <w:rPr>
+          <w:b/>
+          <w:bCs/>
+        </w:rPr>
+        <w:t xml:space="preserve">Edit it in Page details</w:t>
+      </w:r>
+      <w:r>
+        <w:t xml:space="preserve"> link.</w:t>
       </w:r>
     </w:p>
     <w:p>
@@ -3529,6 +3629,26 @@
           <w:bCs/>
         </w:rPr>
         <w:t xml:space="preserve">Tags</w:t>
+      </w:r>
+      <w:r>
+        <w:t xml:space="preserve">. Once you tick more than one ministry, </w:t>
+      </w:r>
+      <w:r>
+        <w:rPr>
+          <w:b/>
+          <w:bCs/>
+        </w:rPr>
+        <w:t xml:space="preserve">Lead ministry (needed before approving)</w:t>
+      </w:r>
+      <w:r>
+        <w:t xml:space="preserve"> appears and says "Choose the lead ministry" until you do. An advisory doesn't need one and offers </w:t>
+      </w:r>
+      <w:r>
+        <w:rPr>
+          <w:b/>
+          <w:bCs/>
+        </w:rPr>
+        <w:t xml:space="preserve">(none)</w:t>
       </w:r>
       <w:r>
         <w:t xml:space="preserve">.</w:t>
@@ -4587,7 +4707,7 @@
         <w:spacing w:after="120"/>
       </w:pPr>
       <w:r>
-        <w:t xml:space="preserve">When a button is greyed out, the reasons are listed under it, such as "Approve is unavailable until:" and "Choose at least one ministry.". Each reason links to the part of the release to fix.</w:t>
+        <w:t xml:space="preserve">When a button is greyed out, the reasons are listed under it, such as "Approve is unavailable until:" and "Choose at least one ministry.". On a draft, "Also needed before it can be published:" lists what publishing will need too. A scheduled release can still have something missing, listed under "Before the scheduled time:", and a published one under "Before your next save can republish it:", because each publish checks again. Each reason links to the part of the release to fix.</w:t>
       </w:r>
     </w:p>
     <w:p>
@@ -4853,7 +4973,7 @@
         <w:t xml:space="preserve">Schedule</w:t>
       </w:r>
       <w:r>
-        <w:t xml:space="preserve">. If the release has a planned publish date still ahead, the date and time are filled in from it.</w:t>
+        <w:t xml:space="preserve">. If the release has a planned publish date still ahead, the date and time are filled in from it, and the panel says "Filled in from the planned publish date."</w:t>
       </w:r>
     </w:p>
     <w:p>
@@ -4985,7 +5105,7 @@
           <w:b/>
           <w:bCs/>
         </w:rPr>
-        <w:t xml:space="preserve">Planned publish date (not yet committed)</w:t>
+        <w:t xml:space="preserve">Planned publish date (for planning only)</w:t>
       </w:r>
       <w:r>
         <w:t xml:space="preserve">, in </w:t>
@@ -4998,7 +5118,7 @@
         <w:t xml:space="preserve">Publish settings</w:t>
       </w:r>
       <w:r>
-        <w:t xml:space="preserve">, is only a plan: nothing happens at that time. It shows on </w:t>
+        <w:t xml:space="preserve">, is a plan: nothing happens at that time. It shows on </w:t>
       </w:r>
       <w:r>
         <w:rPr>
@@ -5038,7 +5158,7 @@
         <w:t xml:space="preserve">Schedule</w:t>
       </w:r>
       <w:r>
-        <w:t xml:space="preserve"> commits a time.</w:t>
+        <w:t xml:space="preserve"> sets when the release goes out.</w:t>
       </w:r>
     </w:p>
     <w:p>
@@ -5099,10 +5219,40 @@
           <w:b/>
           <w:bCs/>
         </w:rPr>
-        <w:t xml:space="preserve">Send to media distribution lists</w:t>
-      </w:r>
-      <w:r>
-        <w:t xml:space="preserve">: tick it, then tick the lists. A retired list a release already had shows "(retired)" and gets nothing.</w:t>
+        <w:t xml:space="preserve">Media distribution lists</w:t>
+      </w:r>
+      <w:r>
+        <w:t xml:space="preserve">: tick each list that should get the media email. With none ticked, no media email goes out. On a release brought over from the old system you may see "As saved, these lists won't get the media email. Save Publish settings and they will." </w:t>
+      </w:r>
+      <w:r>
+        <w:rPr>
+          <w:b/>
+          <w:bCs/>
+        </w:rPr>
+        <w:t xml:space="preserve">Publish settings</w:t>
+      </w:r>
+      <w:r>
+        <w:t xml:space="preserve"> then says </w:t>
+      </w:r>
+      <w:r>
+        <w:rPr>
+          <w:b/>
+          <w:bCs/>
+        </w:rPr>
+        <w:t xml:space="preserve">Unsaved</w:t>
+      </w:r>
+      <w:r>
+        <w:t xml:space="preserve">: choose </w:t>
+      </w:r>
+      <w:r>
+        <w:rPr>
+          <w:b/>
+          <w:bCs/>
+        </w:rPr>
+        <w:t xml:space="preserve">Save changes</w:t>
+      </w:r>
+      <w:r>
+        <w:t xml:space="preserve"> and the ticked lists get it. If that release went out before and is now off the site, it says "As saved, these lists won't get the media email when it's republished." instead, and nothing is marked unsaved: the old system may already have emailed those lists. A retired list a release already had shows "(retired)" and gets nothing; if only retired lists are ticked, the section says "The ticked lists are retired and won't get the media email."</w:t>
       </w:r>
     </w:p>
     <w:p>

</xml_diff>

<commit_message>
caded7f7229f8004973ec384c3dd957bc9cf5ace deploy: siteground artifact
</commit_message>
<xml_diff>
--- a/hub/manuals/nrms-editor.docx
+++ b/hub/manuals/nrms-editor.docx
@@ -3434,7 +3434,7 @@
         <w:t xml:space="preserve">URL key</w:t>
       </w:r>
       <w:r>
-        <w:t xml:space="preserve">: the last part of the release's public address. A release or advisory gets one when it is approved. A story's or factsheet's comes from its headline, and you can change it until it is scheduled.</w:t>
+        <w:t xml:space="preserve">: the last part of the release's public address. A release or advisory gets one when it is approved. A story's or factsheet's comes from its headline, and you can change it until it is scheduled. Once a story or factsheet has been published, its URL key never changes, even after an unpublish: changing the headline leaves it as it is, and the box says "This Story has been published, so its URL key can't change." (or Factsheet).</w:t>
       </w:r>
     </w:p>
     <w:p>
@@ -6476,7 +6476,7 @@
         <w:t xml:space="preserve">Schedule</w:t>
       </w:r>
       <w:r>
-        <w:t xml:space="preserve">. It keeps its numbers and its web address.</w:t>
+        <w:t xml:space="preserve">. It keeps its numbers and its web address, even if you change its headline while it is off the site.</w:t>
       </w:r>
     </w:p>
     <w:p>

</xml_diff>

<commit_message>
e6be2944358ded48162ff0b03c594693008efc5f deploy: siteground artifact
</commit_message>
<xml_diff>
--- a/hub/manuals/nrms-editor.docx
+++ b/hub/manuals/nrms-editor.docx
@@ -887,7 +887,7 @@
         <w:tc>
           <w:p>
             <w:r>
-              <w:t xml:space="preserve">Releases planned or scheduled from now on, and the Calendar activities a release may be planned for.</w:t>
+              <w:t xml:space="preserve">Releases planned or scheduled from now on, releases whose time passed in the last 24 hours but haven't gone out, and the Calendar activities a release may be planned for.</w:t>
             </w:r>
           </w:p>
         </w:tc>
@@ -1228,14 +1228,8 @@
               <w:t xml:space="preserve">Approved</w:t>
             </w:r>
             <w:r>
-              <w:t xml:space="preserve"> badge.</w:t>
-            </w:r>
-          </w:p>
-        </w:tc>
-      </w:tr>
-      <w:tr>
-        <w:tc>
-          <w:p>
+              <w:t xml:space="preserve"> badge. Its status label is amber with a dashed edge, so it doesn't look like </w:t>
+            </w:r>
             <w:r>
               <w:rPr>
                 <w:b/>
@@ -1243,6 +1237,22 @@
               </w:rPr>
               <w:t xml:space="preserve">Scheduled</w:t>
             </w:r>
+            <w:r>
+              <w:t xml:space="preserve">.</w:t>
+            </w:r>
+          </w:p>
+        </w:tc>
+      </w:tr>
+      <w:tr>
+        <w:tc>
+          <w:p>
+            <w:r>
+              <w:rPr>
+                <w:b/>
+                <w:bCs/>
+              </w:rPr>
+              <w:t xml:space="preserve">Scheduled</w:t>
+            </w:r>
           </w:p>
         </w:tc>
         <w:tc>
@@ -1411,7 +1421,7 @@
         <w:t xml:space="preserve">Forecast</w:t>
       </w:r>
       <w:r>
-        <w:t xml:space="preserve"> shows what is coming, so you can see what is already planned before you start something new.</w:t>
+        <w:t xml:space="preserve"> shows what is coming, so you can see what is already planned before you start something new. A release whose time has passed but hasn't gone out stays on the list for 24 hours after that time, labelled "Planned time passed – not published" in red, so you can see it was due and nothing went out. Schedule or publish it if it should go out.</w:t>
       </w:r>
     </w:p>
     <w:p>
@@ -2703,7 +2713,25 @@
         <w:t xml:space="preserve">Save changes</w:t>
       </w:r>
       <w:r>
-        <w:t xml:space="preserve"> in that bar, or press Ctrl+S (Command+S on a Mac). Pressing Enter in a one-line field saves too.</w:t>
+        <w:t xml:space="preserve"> in that bar, or press Ctrl+S (Command+S on a Mac). Pressing Enter in a one-line field saves too. On a published release the button reads </w:t>
+      </w:r>
+      <w:r>
+        <w:rPr>
+          <w:b/>
+          <w:bCs/>
+        </w:rPr>
+        <w:t xml:space="preserve">Save and republish</w:t>
+      </w:r>
+      <w:r>
+        <w:t xml:space="preserve">, because saving puts the change on the public site: see </w:t>
+      </w:r>
+      <w:hyperlink w:history="1" w:anchor="section_8">
+        <w:r>
+          <w:t xml:space="preserve">Correct, feature, unpublish or delete</w:t>
+        </w:r>
+      </w:hyperlink>
+      <w:r>
+        <w:t xml:space="preserve">.</w:t>
       </w:r>
     </w:p>
     <w:p>
@@ -2789,7 +2817,17 @@
         <w:t xml:space="preserve">Leave</w:t>
       </w:r>
       <w:r>
-        <w:t xml:space="preserve"> to lose them. If your sign-in runs out while you are writing, sign in again in the same browser tab: the text you typed in a document comes back.</w:t>
+        <w:t xml:space="preserve"> to lose them; they don't come back the next time you open the release. If your sign-in runs out while you are writing, sign in again in the same browser tab: the text you typed in a document comes back, with "Your unsaved changes were restored." If someone changed the release in the meantime, it also says saving them will ask you to reload first, so your older text can't overwrite their newer changes. Reloading shows their version instead of yours, so copy anything you want to keep before you choose </w:t>
+      </w:r>
+      <w:r>
+        <w:rPr>
+          <w:b/>
+          <w:bCs/>
+        </w:rPr>
+        <w:t xml:space="preserve">Reload</w:t>
+      </w:r>
+      <w:r>
+        <w:t xml:space="preserve">.</w:t>
       </w:r>
     </w:p>
     <w:p>
@@ -4840,11 +4878,7 @@
     </w:p>
     <w:p>
       <w:pPr>
-        <w:pStyle w:val="ListParagraph"/>
-        <w:numPr>
-          <w:ilvl w:val="0"/>
-          <w:numId w:val="10"/>
-        </w:numPr>
+        <w:spacing w:after="120"/>
       </w:pPr>
       <w:r>
         <w:t xml:space="preserve">Choose </w:t>
@@ -4893,7 +4927,101 @@
         </w:numPr>
       </w:pPr>
       <w:r>
-        <w:t xml:space="preserve">which News On Demand subscribers are emailed, such as "Emails News on Demand subscribers who follow any of: Health — and everyone subscribed to all news.", or "News on Demand subscribers will not be emailed."</w:t>
+        <w:t xml:space="preserve">which News On Demand subscribers are emailed, such as "Emails News on Demand subscribers who follow any of: Health — and everyone subscribed to all news.", or "News on Demand subscribers will not be emailed.";</w:t>
+      </w:r>
+    </w:p>
+    <w:p>
+      <w:pPr>
+        <w:pStyle w:val="ListParagraph"/>
+        <w:numPr>
+          <w:ilvl w:val="1"/>
+          <w:numId w:val="1"/>
+        </w:numPr>
+      </w:pPr>
+      <w:r>
+        <w:t xml:space="preserve">how many people that is, such as "Emails about 40,000 News on Demand subscribers and about 312 media contacts now. About 1,200 daily digest subscribers get it in the next 5 PM digest." The first numbers are the people emailed as soon as it goes out; the digest number is the people who get it in that evening's daily digest, while it is still on the site. Someone on one of its media lists who also follows its categories gets only the media email, and is counted once, as a media contact. If a number can't be worked out just then, it says "(count unavailable)" or "How many people it reaches isn't available right now." You can still publish. A number much bigger than you expect is a sign the wrong categories or lists are ticked.</w:t>
+      </w:r>
+    </w:p>
+    <w:p>
+      <w:pPr>
+        <w:spacing w:after="120"/>
+      </w:pPr>
+      <w:r>
+        <w:t xml:space="preserve">If the release has a planned publish date still ahead, the box starts with a warning such as "This release is planned for Nov 3, 2026 10:00 AM. Publishing now puts it out early." If it is under embargo until then, choose </w:t>
+      </w:r>
+      <w:r>
+        <w:rPr>
+          <w:b/>
+          <w:bCs/>
+        </w:rPr>
+        <w:t xml:space="preserve">Cancel</w:t>
+      </w:r>
+      <w:r>
+        <w:t xml:space="preserve"> and use </w:t>
+      </w:r>
+      <w:r>
+        <w:rPr>
+          <w:b/>
+          <w:bCs/>
+        </w:rPr>
+        <w:t xml:space="preserve">Schedule</w:t>
+      </w:r>
+      <w:r>
+        <w:t xml:space="preserve"> instead.</w:t>
+      </w:r>
+    </w:p>
+    <w:p>
+      <w:pPr>
+        <w:spacing w:after="120"/>
+      </w:pPr>
+      <w:r>
+        <w:t xml:space="preserve">Check the list. Choose </w:t>
+      </w:r>
+      <w:r>
+        <w:rPr>
+          <w:b/>
+          <w:bCs/>
+        </w:rPr>
+        <w:t xml:space="preserve">Publish now</w:t>
+      </w:r>
+      <w:r>
+        <w:t xml:space="preserve">.</w:t>
+      </w:r>
+    </w:p>
+    <w:p>
+      <w:pPr>
+        <w:spacing w:after="120"/>
+      </w:pPr>
+      <w:r>
+        <w:t xml:space="preserve">The status shows </w:t>
+      </w:r>
+      <w:r>
+        <w:rPr>
+          <w:b/>
+          <w:bCs/>
+        </w:rPr>
+        <w:t xml:space="preserve">Publishing...</w:t>
+      </w:r>
+      <w:r>
+        <w:t xml:space="preserve">, then </w:t>
+      </w:r>
+      <w:r>
+        <w:rPr>
+          <w:b/>
+          <w:bCs/>
+        </w:rPr>
+        <w:t xml:space="preserve">Published</w:t>
+      </w:r>
+      <w:r>
+        <w:t xml:space="preserve">, usually within a minute. The page updates by itself: "This page updates on its own until the release is done — no need to reload."</w:t>
+      </w:r>
+    </w:p>
+    <w:p>
+      <w:pPr>
+        <w:pStyle w:val="Heading2"/>
+      </w:pPr>
+      <w:r>
+        <w:t xml:space="preserve">Schedule</w:t>
       </w:r>
     </w:p>
     <w:p>
@@ -4905,7 +5033,71 @@
         </w:numPr>
       </w:pPr>
       <w:r>
-        <w:t xml:space="preserve">Check the list. Choose </w:t>
+        <w:t xml:space="preserve">Choose </w:t>
+      </w:r>
+      <w:r>
+        <w:rPr>
+          <w:b/>
+          <w:bCs/>
+        </w:rPr>
+        <w:t xml:space="preserve">Schedule</w:t>
+      </w:r>
+      <w:r>
+        <w:t xml:space="preserve">. If the release has a planned publish date still ahead, the date and time are filled in from it, and the panel says "Filled in from the planned publish date."</w:t>
+      </w:r>
+    </w:p>
+    <w:p>
+      <w:pPr>
+        <w:pStyle w:val="ListParagraph"/>
+        <w:numPr>
+          <w:ilvl w:val="0"/>
+          <w:numId w:val="10"/>
+        </w:numPr>
+      </w:pPr>
+      <w:r>
+        <w:t xml:space="preserve">Enter the </w:t>
+      </w:r>
+      <w:r>
+        <w:rPr>
+          <w:b/>
+          <w:bCs/>
+        </w:rPr>
+        <w:t xml:space="preserve">Date</w:t>
+      </w:r>
+      <w:r>
+        <w:t xml:space="preserve"> and </w:t>
+      </w:r>
+      <w:r>
+        <w:rPr>
+          <w:b/>
+          <w:bCs/>
+        </w:rPr>
+        <w:t xml:space="preserve">Time (BC time)</w:t>
+      </w:r>
+      <w:r>
+        <w:t xml:space="preserve">. A time that has passed shows "Choose a time in the future, or use Publish now."</w:t>
+      </w:r>
+    </w:p>
+    <w:p>
+      <w:pPr>
+        <w:pStyle w:val="ListParagraph"/>
+        <w:numPr>
+          <w:ilvl w:val="0"/>
+          <w:numId w:val="10"/>
+        </w:numPr>
+      </w:pPr>
+      <w:r>
+        <w:t xml:space="preserve">Choose </w:t>
+      </w:r>
+      <w:r>
+        <w:rPr>
+          <w:b/>
+          <w:bCs/>
+        </w:rPr>
+        <w:t xml:space="preserve">Confirm schedule</w:t>
+      </w:r>
+      <w:r>
+        <w:t xml:space="preserve">. A box asks, for example, "Schedule this release for Friday, November 20, 2026 at 10:00 AM Pacific time?" and lists who will be emailed, and about how many people, as for </w:t>
       </w:r>
       <w:r>
         <w:rPr>
@@ -4920,30 +5112,50 @@
     </w:p>
     <w:p>
       <w:pPr>
-        <w:spacing w:after="120"/>
-      </w:pPr>
-      <w:r>
-        <w:t xml:space="preserve">The status shows </w:t>
-      </w:r>
-      <w:r>
-        <w:rPr>
-          <w:b/>
-          <w:bCs/>
-        </w:rPr>
-        <w:t xml:space="preserve">Publishing...</w:t>
-      </w:r>
-      <w:r>
-        <w:t xml:space="preserve">, then </w:t>
-      </w:r>
-      <w:r>
-        <w:rPr>
-          <w:b/>
-          <w:bCs/>
-        </w:rPr>
-        <w:t xml:space="preserve">Published</w:t>
-      </w:r>
-      <w:r>
-        <w:t xml:space="preserve">, usually within a minute. The page updates by itself: "This page updates on its own until the release is done — no need to reload."</w:t>
+        <w:pStyle w:val="ListParagraph"/>
+        <w:numPr>
+          <w:ilvl w:val="0"/>
+          <w:numId w:val="10"/>
+        </w:numPr>
+      </w:pPr>
+      <w:r>
+        <w:t xml:space="preserve">Choose </w:t>
+      </w:r>
+      <w:r>
+        <w:rPr>
+          <w:b/>
+          <w:bCs/>
+        </w:rPr>
+        <w:t xml:space="preserve">Schedule</w:t>
+      </w:r>
+      <w:r>
+        <w:t xml:space="preserve">.</w:t>
+      </w:r>
+    </w:p>
+    <w:p>
+      <w:pPr>
+        <w:spacing w:after="120"/>
+      </w:pPr>
+      <w:r>
+        <w:t xml:space="preserve">The release moves to </w:t>
+      </w:r>
+      <w:r>
+        <w:rPr>
+          <w:b/>
+          <w:bCs/>
+        </w:rPr>
+        <w:t xml:space="preserve">Scheduled</w:t>
+      </w:r>
+      <w:r>
+        <w:t xml:space="preserve">. At that time it publishes by itself and the emails go out. Until then nothing is public: not the page, not its files, not the emails.</w:t>
+      </w:r>
+    </w:p>
+    <w:p>
+      <w:pPr>
+        <w:spacing w:after="120"/>
+      </w:pPr>
+      <w:r>
+        <w:t xml:space="preserve">You can still change a scheduled release. What goes out is the release as saved at the publish time.</w:t>
       </w:r>
     </w:p>
     <w:p>
@@ -4951,141 +5163,72 @@
         <w:pStyle w:val="Heading2"/>
       </w:pPr>
       <w:r>
+        <w:t xml:space="preserve">The planned publish date</w:t>
+      </w:r>
+    </w:p>
+    <w:p>
+      <w:pPr>
+        <w:spacing w:after="120"/>
+      </w:pPr>
+      <w:r>
+        <w:rPr>
+          <w:b/>
+          <w:bCs/>
+        </w:rPr>
+        <w:t xml:space="preserve">Planned publish date (for planning only)</w:t>
+      </w:r>
+      <w:r>
+        <w:t xml:space="preserve">, in </w:t>
+      </w:r>
+      <w:r>
+        <w:rPr>
+          <w:b/>
+          <w:bCs/>
+        </w:rPr>
+        <w:t xml:space="preserve">Publish settings</w:t>
+      </w:r>
+      <w:r>
+        <w:t xml:space="preserve">, is a plan: nothing happens at that time. It shows on </w:t>
+      </w:r>
+      <w:r>
+        <w:rPr>
+          <w:b/>
+          <w:bCs/>
+        </w:rPr>
+        <w:t xml:space="preserve">Forecast</w:t>
+      </w:r>
+      <w:r>
+        <w:t xml:space="preserve"> and makes the status </w:t>
+      </w:r>
+      <w:r>
+        <w:rPr>
+          <w:b/>
+          <w:bCs/>
+        </w:rPr>
+        <w:t xml:space="preserve">Planned</w:t>
+      </w:r>
+      <w:r>
+        <w:t xml:space="preserve">. Choose </w:t>
+      </w:r>
+      <w:r>
+        <w:rPr>
+          <w:b/>
+          <w:bCs/>
+        </w:rPr>
+        <w:t xml:space="preserve">Clear planned date</w:t>
+      </w:r>
+      <w:r>
+        <w:t xml:space="preserve"> to remove it. Only </w:t>
+      </w:r>
+      <w:r>
+        <w:rPr>
+          <w:b/>
+          <w:bCs/>
+        </w:rPr>
         <w:t xml:space="preserve">Schedule</w:t>
       </w:r>
-    </w:p>
-    <w:p>
-      <w:pPr>
-        <w:pStyle w:val="ListParagraph"/>
-        <w:numPr>
-          <w:ilvl w:val="0"/>
-          <w:numId w:val="11"/>
-        </w:numPr>
-      </w:pPr>
-      <w:r>
-        <w:t xml:space="preserve">Choose </w:t>
-      </w:r>
-      <w:r>
-        <w:rPr>
-          <w:b/>
-          <w:bCs/>
-        </w:rPr>
-        <w:t xml:space="preserve">Schedule</w:t>
-      </w:r>
-      <w:r>
-        <w:t xml:space="preserve">. If the release has a planned publish date still ahead, the date and time are filled in from it, and the panel says "Filled in from the planned publish date."</w:t>
-      </w:r>
-    </w:p>
-    <w:p>
-      <w:pPr>
-        <w:pStyle w:val="ListParagraph"/>
-        <w:numPr>
-          <w:ilvl w:val="0"/>
-          <w:numId w:val="11"/>
-        </w:numPr>
-      </w:pPr>
-      <w:r>
-        <w:t xml:space="preserve">Enter the </w:t>
-      </w:r>
-      <w:r>
-        <w:rPr>
-          <w:b/>
-          <w:bCs/>
-        </w:rPr>
-        <w:t xml:space="preserve">Date</w:t>
-      </w:r>
-      <w:r>
-        <w:t xml:space="preserve"> and </w:t>
-      </w:r>
-      <w:r>
-        <w:rPr>
-          <w:b/>
-          <w:bCs/>
-        </w:rPr>
-        <w:t xml:space="preserve">Time (BC time)</w:t>
-      </w:r>
-      <w:r>
-        <w:t xml:space="preserve">. A time that has passed shows "Choose a time in the future, or use Publish now."</w:t>
-      </w:r>
-    </w:p>
-    <w:p>
-      <w:pPr>
-        <w:pStyle w:val="ListParagraph"/>
-        <w:numPr>
-          <w:ilvl w:val="0"/>
-          <w:numId w:val="11"/>
-        </w:numPr>
-      </w:pPr>
-      <w:r>
-        <w:t xml:space="preserve">Choose </w:t>
-      </w:r>
-      <w:r>
-        <w:rPr>
-          <w:b/>
-          <w:bCs/>
-        </w:rPr>
-        <w:t xml:space="preserve">Confirm schedule</w:t>
-      </w:r>
-      <w:r>
-        <w:t xml:space="preserve">. A box asks, for example, "Schedule this release for Friday, November 20, 2026 at 10:00 AM Pacific time?" and lists who will be emailed, as for </w:t>
-      </w:r>
-      <w:r>
-        <w:rPr>
-          <w:b/>
-          <w:bCs/>
-        </w:rPr>
-        <w:t xml:space="preserve">Publish now</w:t>
-      </w:r>
-      <w:r>
-        <w:t xml:space="preserve">.</w:t>
-      </w:r>
-    </w:p>
-    <w:p>
-      <w:pPr>
-        <w:pStyle w:val="ListParagraph"/>
-        <w:numPr>
-          <w:ilvl w:val="0"/>
-          <w:numId w:val="11"/>
-        </w:numPr>
-      </w:pPr>
-      <w:r>
-        <w:t xml:space="preserve">Choose </w:t>
-      </w:r>
-      <w:r>
-        <w:rPr>
-          <w:b/>
-          <w:bCs/>
-        </w:rPr>
-        <w:t xml:space="preserve">Schedule</w:t>
-      </w:r>
-      <w:r>
-        <w:t xml:space="preserve">.</w:t>
-      </w:r>
-    </w:p>
-    <w:p>
-      <w:pPr>
-        <w:spacing w:after="120"/>
-      </w:pPr>
-      <w:r>
-        <w:t xml:space="preserve">The release moves to </w:t>
-      </w:r>
-      <w:r>
-        <w:rPr>
-          <w:b/>
-          <w:bCs/>
-        </w:rPr>
-        <w:t xml:space="preserve">Scheduled</w:t>
-      </w:r>
-      <w:r>
-        <w:t xml:space="preserve">. At that time it publishes by itself and the emails go out. Until then nothing is public: not the page, not its files, not the emails.</w:t>
-      </w:r>
-    </w:p>
-    <w:p>
-      <w:pPr>
-        <w:spacing w:after="120"/>
-      </w:pPr>
-      <w:r>
-        <w:t xml:space="preserve">You can still change a scheduled release. What goes out is the release as saved at the publish time.</w:t>
+      <w:r>
+        <w:t xml:space="preserve"> sets when the release goes out.</w:t>
       </w:r>
     </w:p>
     <w:p>
@@ -5093,22 +5236,15 @@
         <w:pStyle w:val="Heading2"/>
       </w:pPr>
       <w:r>
-        <w:t xml:space="preserve">The planned publish date</w:t>
-      </w:r>
-    </w:p>
-    <w:p>
-      <w:pPr>
-        <w:spacing w:after="120"/>
-      </w:pPr>
-      <w:r>
-        <w:rPr>
-          <w:b/>
-          <w:bCs/>
-        </w:rPr>
-        <w:t xml:space="preserve">Planned publish date (for planning only)</w:t>
-      </w:r>
-      <w:r>
-        <w:t xml:space="preserve">, in </w:t>
+        <w:t xml:space="preserve">Who is emailed</w:t>
+      </w:r>
+    </w:p>
+    <w:p>
+      <w:pPr>
+        <w:spacing w:after="120"/>
+      </w:pPr>
+      <w:r>
+        <w:t xml:space="preserve">Set this in </w:t>
       </w:r>
       <w:r>
         <w:rPr>
@@ -5118,63 +5254,45 @@
         <w:t xml:space="preserve">Publish settings</w:t>
       </w:r>
       <w:r>
-        <w:t xml:space="preserve">, is a plan: nothing happens at that time. It shows on </w:t>
-      </w:r>
-      <w:r>
-        <w:rPr>
-          <w:b/>
-          <w:bCs/>
-        </w:rPr>
-        <w:t xml:space="preserve">Forecast</w:t>
-      </w:r>
-      <w:r>
-        <w:t xml:space="preserve"> and makes the status </w:t>
-      </w:r>
-      <w:r>
-        <w:rPr>
-          <w:b/>
-          <w:bCs/>
-        </w:rPr>
-        <w:t xml:space="preserve">Planned</w:t>
-      </w:r>
-      <w:r>
-        <w:t xml:space="preserve">. Choose </w:t>
-      </w:r>
-      <w:r>
-        <w:rPr>
-          <w:b/>
-          <w:bCs/>
-        </w:rPr>
-        <w:t xml:space="preserve">Clear planned date</w:t>
-      </w:r>
-      <w:r>
-        <w:t xml:space="preserve"> to remove it. Only </w:t>
-      </w:r>
-      <w:r>
-        <w:rPr>
-          <w:b/>
-          <w:bCs/>
-        </w:rPr>
-        <w:t xml:space="preserve">Schedule</w:t>
-      </w:r>
-      <w:r>
-        <w:t xml:space="preserve"> sets when the release goes out.</w:t>
-      </w:r>
-    </w:p>
-    <w:p>
-      <w:pPr>
-        <w:pStyle w:val="Heading2"/>
-      </w:pPr>
-      <w:r>
-        <w:t xml:space="preserve">Who is emailed</w:t>
-      </w:r>
-    </w:p>
-    <w:p>
-      <w:pPr>
-        <w:spacing w:after="120"/>
-      </w:pPr>
-      <w:r>
-        <w:t xml:space="preserve">Set this in </w:t>
+        <w:t xml:space="preserve"> before you publish.</w:t>
+      </w:r>
+    </w:p>
+    <w:p>
+      <w:pPr>
+        <w:pStyle w:val="ListParagraph"/>
+        <w:numPr>
+          <w:ilvl w:val="0"/>
+          <w:numId w:val="1"/>
+        </w:numPr>
+      </w:pPr>
+      <w:r>
+        <w:rPr>
+          <w:b/>
+          <w:bCs/>
+        </w:rPr>
+        <w:t xml:space="preserve">Send to News On Demand subscribers</w:t>
+      </w:r>
+      <w:r>
+        <w:t xml:space="preserve">: ticked for releases, unticked for stories and factsheets, and not available for advisories.</w:t>
+      </w:r>
+    </w:p>
+    <w:p>
+      <w:pPr>
+        <w:pStyle w:val="ListParagraph"/>
+        <w:numPr>
+          <w:ilvl w:val="0"/>
+          <w:numId w:val="1"/>
+        </w:numPr>
+      </w:pPr>
+      <w:r>
+        <w:rPr>
+          <w:b/>
+          <w:bCs/>
+        </w:rPr>
+        <w:t xml:space="preserve">Media distribution lists</w:t>
+      </w:r>
+      <w:r>
+        <w:t xml:space="preserve">: tick each list that should get the media email. With none ticked, no media email goes out. On a release brought over from the old system you may see "As saved, these lists won't get the media email. Save Publish settings and they will." </w:t>
       </w:r>
       <w:r>
         <w:rPr>
@@ -5184,54 +5302,6 @@
         <w:t xml:space="preserve">Publish settings</w:t>
       </w:r>
       <w:r>
-        <w:t xml:space="preserve"> before you publish.</w:t>
-      </w:r>
-    </w:p>
-    <w:p>
-      <w:pPr>
-        <w:pStyle w:val="ListParagraph"/>
-        <w:numPr>
-          <w:ilvl w:val="0"/>
-          <w:numId w:val="1"/>
-        </w:numPr>
-      </w:pPr>
-      <w:r>
-        <w:rPr>
-          <w:b/>
-          <w:bCs/>
-        </w:rPr>
-        <w:t xml:space="preserve">Send to News On Demand subscribers</w:t>
-      </w:r>
-      <w:r>
-        <w:t xml:space="preserve">: ticked for releases, unticked for stories and factsheets, and not available for advisories.</w:t>
-      </w:r>
-    </w:p>
-    <w:p>
-      <w:pPr>
-        <w:pStyle w:val="ListParagraph"/>
-        <w:numPr>
-          <w:ilvl w:val="0"/>
-          <w:numId w:val="1"/>
-        </w:numPr>
-      </w:pPr>
-      <w:r>
-        <w:rPr>
-          <w:b/>
-          <w:bCs/>
-        </w:rPr>
-        <w:t xml:space="preserve">Media distribution lists</w:t>
-      </w:r>
-      <w:r>
-        <w:t xml:space="preserve">: tick each list that should get the media email. With none ticked, no media email goes out. On a release brought over from the old system you may see "As saved, these lists won't get the media email. Save Publish settings and they will." </w:t>
-      </w:r>
-      <w:r>
-        <w:rPr>
-          <w:b/>
-          <w:bCs/>
-        </w:rPr>
-        <w:t xml:space="preserve">Publish settings</w:t>
-      </w:r>
-      <w:r>
         <w:t xml:space="preserve"> then says </w:t>
       </w:r>
       <w:r>
@@ -5252,7 +5322,7 @@
         <w:t xml:space="preserve">Save changes</w:t>
       </w:r>
       <w:r>
-        <w:t xml:space="preserve"> and the ticked lists get it. If that release went out before and is now off the site, it says "As saved, these lists won't get the media email when it's republished." instead, and nothing is marked unsaved: the old system may already have emailed those lists. A retired list a release already had shows "(retired)" and gets nothing; if only retired lists are ticked, the section says "The ticked lists are retired and won't get the media email."</w:t>
+        <w:t xml:space="preserve"> and the ticked lists get it. If that release went out before and is now off the site, it says "As saved, these lists won't get the media email when it's republished." instead, and nothing is marked unsaved: the old system may already have emailed those lists. A retired list a release already had shows "(retired)" and gets nothing; if only retired lists are ticked, the section says "The ticked lists are retired and won't get the media email." Once a release or factsheet has gone out, its lists are greyed out with "Media lists can't change after it has gone out.", even if it was unpublished since.</w:t>
       </w:r>
     </w:p>
     <w:p>
@@ -5295,7 +5365,27 @@
         <w:t xml:space="preserve">Cancel schedule</w:t>
       </w:r>
       <w:r>
-        <w:t xml:space="preserve"> stops a scheduled release from going out. It goes back to </w:t>
+        <w:t xml:space="preserve"> stops a scheduled release from going out. A box asks first, naming the time, for example "Cancel the publish on Nov 3, 2026 10:00 AM?". When the time is less than 30 minutes away it also says how soon, such as "It's due to go out in 10 minutes." Choose </w:t>
+      </w:r>
+      <w:r>
+        <w:rPr>
+          <w:b/>
+          <w:bCs/>
+        </w:rPr>
+        <w:t xml:space="preserve">Cancel schedule</w:t>
+      </w:r>
+      <w:r>
+        <w:t xml:space="preserve"> to cancel it, or </w:t>
+      </w:r>
+      <w:r>
+        <w:rPr>
+          <w:b/>
+          <w:bCs/>
+        </w:rPr>
+        <w:t xml:space="preserve">Keep schedule</w:t>
+      </w:r>
+      <w:r>
+        <w:t xml:space="preserve"> to leave it as it is. A cancelled release goes back to </w:t>
       </w:r>
       <w:r>
         <w:rPr>
@@ -5305,7 +5395,7 @@
         <w:t xml:space="preserve">Drafts</w:t>
       </w:r>
       <w:r>
-        <w:t xml:space="preserve"> as approved, and its time stays as the planned date. It doesn't ask first.</w:t>
+        <w:t xml:space="preserve"> as approved, and its time stays as the planned date.</w:t>
       </w:r>
     </w:p>
     <w:p>
@@ -5905,7 +5995,17 @@
         </w:numPr>
       </w:pPr>
       <w:r>
-        <w:t xml:space="preserve">Media lists can't be changed on a release or factsheet once it has gone out.</w:t>
+        <w:t xml:space="preserve">Media lists can't be changed on a release or factsheet once it has gone out: the boxes in </w:t>
+      </w:r>
+      <w:r>
+        <w:rPr>
+          <w:b/>
+          <w:bCs/>
+        </w:rPr>
+        <w:t xml:space="preserve">Publish settings</w:t>
+      </w:r>
+      <w:r>
+        <w:t xml:space="preserve"> are greyed out, with "Media lists can't change after it has gone out."</w:t>
       </w:r>
     </w:p>
     <w:p>
@@ -6090,11 +6190,147 @@
         <w:pStyle w:val="ListParagraph"/>
         <w:numPr>
           <w:ilvl w:val="0"/>
+          <w:numId w:val="11"/>
+        </w:numPr>
+      </w:pPr>
+      <w:r>
+        <w:t xml:space="preserve">Open the release and make the change. The bar along the bottom says "Saving republishes this release on the public site."</w:t>
+      </w:r>
+    </w:p>
+    <w:p>
+      <w:pPr>
+        <w:pStyle w:val="ListParagraph"/>
+        <w:numPr>
+          <w:ilvl w:val="0"/>
+          <w:numId w:val="11"/>
+        </w:numPr>
+      </w:pPr>
+      <w:r>
+        <w:t xml:space="preserve">Choose </w:t>
+      </w:r>
+      <w:r>
+        <w:rPr>
+          <w:b/>
+          <w:bCs/>
+        </w:rPr>
+        <w:t xml:space="preserve">Save and republish</w:t>
+      </w:r>
+      <w:r>
+        <w:t xml:space="preserve">.</w:t>
+      </w:r>
+    </w:p>
+    <w:p>
+      <w:pPr>
+        <w:spacing w:after="120"/>
+      </w:pPr>
+      <w:r>
+        <w:t xml:space="preserve">It republishes at once: no box asks first. Pressing Enter in a one-line field or Ctrl+S (Command+S on a Mac) saves and republishes too, so finish the whole correction before you press either. The status shows </w:t>
+      </w:r>
+      <w:r>
+        <w:rPr>
+          <w:b/>
+          <w:bCs/>
+        </w:rPr>
+        <w:t xml:space="preserve">Republishing...</w:t>
+      </w:r>
+      <w:r>
+        <w:t xml:space="preserve">, then </w:t>
+      </w:r>
+      <w:r>
+        <w:rPr>
+          <w:b/>
+          <w:bCs/>
+        </w:rPr>
+        <w:t xml:space="preserve">Published</w:t>
+      </w:r>
+      <w:r>
+        <w:t xml:space="preserve">, usually within a minute. </w:t>
+      </w:r>
+      <w:r>
+        <w:rPr>
+          <w:b/>
+          <w:bCs/>
+        </w:rPr>
+        <w:t xml:space="preserve">History</w:t>
+      </w:r>
+      <w:r>
+        <w:t xml:space="preserve"> shows "Republished to …"; with </w:t>
+      </w:r>
+      <w:r>
+        <w:rPr>
+          <w:b/>
+          <w:bCs/>
+        </w:rPr>
+        <w:t xml:space="preserve">Show all</w:t>
+      </w:r>
+      <w:r>
+        <w:t xml:space="preserve"> ticked it also shows "Edited after publishing — will republish". The public page shows the change within a couple of minutes. Nobody is emailed again.</w:t>
+      </w:r>
+    </w:p>
+    <w:p>
+      <w:pPr>
+        <w:spacing w:after="120"/>
+      </w:pPr>
+      <w:r>
+        <w:t xml:space="preserve">Uploading or removing a file counts as a correction too. If a correction fails, the release shows "This release failed" and stays on the public site as it was. Fix the problem, save, then choose </w:t>
+      </w:r>
+      <w:r>
+        <w:rPr>
+          <w:b/>
+          <w:bCs/>
+        </w:rPr>
+        <w:t xml:space="preserve">Publish now</w:t>
+      </w:r>
+      <w:r>
+        <w:t xml:space="preserve">. </w:t>
+      </w:r>
+      <w:r>
+        <w:rPr>
+          <w:b/>
+          <w:bCs/>
+        </w:rPr>
+        <w:t xml:space="preserve">Schedule</w:t>
+      </w:r>
+      <w:r>
+        <w:t xml:space="preserve"> isn't offered: a failed correction goes out at once.</w:t>
+      </w:r>
+    </w:p>
+    <w:p>
+      <w:pPr>
+        <w:pStyle w:val="Heading2"/>
+      </w:pPr>
+      <w:r>
+        <w:t xml:space="preserve">Top and Feature spots</w:t>
+      </w:r>
+    </w:p>
+    <w:p>
+      <w:pPr>
+        <w:spacing w:after="120"/>
+      </w:pPr>
+      <w:r>
+        <w:t xml:space="preserve">Each place on the public site has one Top and one Feature spot: the home page, and each ministry, sector and theme page. A release can take them only while it is published.</w:t>
+      </w:r>
+    </w:p>
+    <w:p>
+      <w:pPr>
+        <w:pStyle w:val="ListParagraph"/>
+        <w:numPr>
+          <w:ilvl w:val="0"/>
           <w:numId w:val="12"/>
         </w:numPr>
       </w:pPr>
       <w:r>
-        <w:t xml:space="preserve">Open the release and make the change.</w:t>
+        <w:t xml:space="preserve">Open the release. </w:t>
+      </w:r>
+      <w:r>
+        <w:rPr>
+          <w:b/>
+          <w:bCs/>
+        </w:rPr>
+        <w:t xml:space="preserve">Top / Feature</w:t>
+      </w:r>
+      <w:r>
+        <w:t xml:space="preserve"> says where it is now, such as "Feature on Home", or "Not in a Top or Feature slot anywhere."</w:t>
       </w:r>
     </w:p>
     <w:p>
@@ -6113,102 +6349,126 @@
           <w:b/>
           <w:bCs/>
         </w:rPr>
+        <w:t xml:space="preserve">Change Top / Feature</w:t>
+      </w:r>
+      <w:r>
+        <w:t xml:space="preserve">. You see </w:t>
+      </w:r>
+      <w:r>
+        <w:rPr>
+          <w:b/>
+          <w:bCs/>
+        </w:rPr>
+        <w:t xml:space="preserve">Home</w:t>
+      </w:r>
+      <w:r>
+        <w:t xml:space="preserve"> and each ministry, sector and theme the release is filed under, as saved. One you have ticked in </w:t>
+      </w:r>
+      <w:r>
+        <w:rPr>
+          <w:b/>
+          <w:bCs/>
+        </w:rPr>
+        <w:t xml:space="preserve">Categories</w:t>
+      </w:r>
+      <w:r>
+        <w:t xml:space="preserve"> but not saved shows "Save to feature here." with no switch; choose </w:t>
+      </w:r>
+      <w:r>
+        <w:rPr>
+          <w:b/>
+          <w:bCs/>
+        </w:rPr>
         <w:t xml:space="preserve">Save changes</w:t>
       </w:r>
       <w:r>
+        <w:t xml:space="preserve"> first.</w:t>
+      </w:r>
+    </w:p>
+    <w:p>
+      <w:pPr>
+        <w:pStyle w:val="ListParagraph"/>
+        <w:numPr>
+          <w:ilvl w:val="0"/>
+          <w:numId w:val="12"/>
+        </w:numPr>
+      </w:pPr>
+      <w:r>
+        <w:t xml:space="preserve">Switch </w:t>
+      </w:r>
+      <w:r>
+        <w:rPr>
+          <w:b/>
+          <w:bCs/>
+        </w:rPr>
+        <w:t xml:space="preserve">Top</w:t>
+      </w:r>
+      <w:r>
+        <w:t xml:space="preserve"> or </w:t>
+      </w:r>
+      <w:r>
+        <w:rPr>
+          <w:b/>
+          <w:bCs/>
+        </w:rPr>
+        <w:t xml:space="preserve">Feature</w:t>
+      </w:r>
+      <w:r>
+        <w:t xml:space="preserve"> on or off for a place.</w:t>
+      </w:r>
+    </w:p>
+    <w:p>
+      <w:pPr>
+        <w:spacing w:after="120"/>
+      </w:pPr>
+      <w:r>
+        <w:t xml:space="preserve">It changes at once, without </w:t>
+      </w:r>
+      <w:r>
+        <w:rPr>
+          <w:b/>
+          <w:bCs/>
+        </w:rPr>
+        <w:t xml:space="preserve">Save changes</w:t>
+      </w:r>
+      <w:r>
+        <w:t xml:space="preserve">, and doesn't republish the release or email anyone. Switching a spot on takes it over from whichever release had it. To see every spot at once, go to </w:t>
+      </w:r>
+      <w:r>
+        <w:rPr>
+          <w:b/>
+          <w:bCs/>
+        </w:rPr>
+        <w:t xml:space="preserve">Website</w:t>
+      </w:r>
+      <w:r>
+        <w:t xml:space="preserve"> &gt; </w:t>
+      </w:r>
+      <w:r>
+        <w:rPr>
+          <w:b/>
+          <w:bCs/>
+        </w:rPr>
+        <w:t xml:space="preserve">What's featured where</w:t>
+      </w:r>
+      <w:r>
         <w:t xml:space="preserve">.</w:t>
       </w:r>
     </w:p>
     <w:p>
       <w:pPr>
-        <w:spacing w:after="120"/>
-      </w:pPr>
-      <w:r>
-        <w:t xml:space="preserve">It republishes at once: no box asks first. The status shows </w:t>
-      </w:r>
-      <w:r>
-        <w:rPr>
-          <w:b/>
-          <w:bCs/>
-        </w:rPr>
-        <w:t xml:space="preserve">Republishing...</w:t>
-      </w:r>
-      <w:r>
-        <w:t xml:space="preserve">, then </w:t>
-      </w:r>
-      <w:r>
-        <w:rPr>
-          <w:b/>
-          <w:bCs/>
-        </w:rPr>
-        <w:t xml:space="preserve">Published</w:t>
-      </w:r>
-      <w:r>
-        <w:t xml:space="preserve">, usually within a minute. </w:t>
-      </w:r>
-      <w:r>
-        <w:rPr>
-          <w:b/>
-          <w:bCs/>
-        </w:rPr>
-        <w:t xml:space="preserve">History</w:t>
-      </w:r>
-      <w:r>
-        <w:t xml:space="preserve"> shows "Republished to …"; with </w:t>
-      </w:r>
-      <w:r>
-        <w:rPr>
-          <w:b/>
-          <w:bCs/>
-        </w:rPr>
-        <w:t xml:space="preserve">Show all</w:t>
-      </w:r>
-      <w:r>
-        <w:t xml:space="preserve"> ticked it also shows "Edited after publishing — will republish". The public page shows the change within a couple of minutes. Nobody is emailed again.</w:t>
-      </w:r>
-    </w:p>
-    <w:p>
-      <w:pPr>
-        <w:spacing w:after="120"/>
-      </w:pPr>
-      <w:r>
-        <w:t xml:space="preserve">Uploading or removing a file counts as a correction too. If a correction fails, the release shows "This release failed" and stays on the public site as it was. Fix the problem, save, then choose </w:t>
-      </w:r>
-      <w:r>
-        <w:rPr>
-          <w:b/>
-          <w:bCs/>
-        </w:rPr>
-        <w:t xml:space="preserve">Publish now</w:t>
-      </w:r>
-      <w:r>
-        <w:t xml:space="preserve">. </w:t>
-      </w:r>
-      <w:r>
-        <w:rPr>
-          <w:b/>
-          <w:bCs/>
-        </w:rPr>
-        <w:t xml:space="preserve">Schedule</w:t>
-      </w:r>
-      <w:r>
-        <w:t xml:space="preserve"> isn't offered: a failed correction goes out at once.</w:t>
-      </w:r>
-    </w:p>
-    <w:p>
-      <w:pPr>
         <w:pStyle w:val="Heading2"/>
       </w:pPr>
       <w:r>
-        <w:t xml:space="preserve">Top and Feature spots</w:t>
-      </w:r>
-    </w:p>
-    <w:p>
-      <w:pPr>
-        <w:spacing w:after="120"/>
-      </w:pPr>
-      <w:r>
-        <w:t xml:space="preserve">Each place on the public site has one Top and one Feature spot: the home page, and each ministry, sector and theme page. A release can take them only while it is published.</w:t>
+        <w:t xml:space="preserve">Unpublish</w:t>
+      </w:r>
+    </w:p>
+    <w:p>
+      <w:pPr>
+        <w:spacing w:after="120"/>
+      </w:pPr>
+      <w:r>
+        <w:t xml:space="preserve">Advisories can't be unpublished.</w:t>
       </w:r>
     </w:p>
     <w:p>
@@ -6220,17 +6480,17 @@
         </w:numPr>
       </w:pPr>
       <w:r>
-        <w:t xml:space="preserve">Open the release. </w:t>
-      </w:r>
-      <w:r>
-        <w:rPr>
-          <w:b/>
-          <w:bCs/>
-        </w:rPr>
-        <w:t xml:space="preserve">Top / Feature</w:t>
-      </w:r>
-      <w:r>
-        <w:t xml:space="preserve"> says where it is now, such as "Feature on Home", or "Not in a Top or Feature slot anywhere."</w:t>
+        <w:t xml:space="preserve">Choose </w:t>
+      </w:r>
+      <w:r>
+        <w:rPr>
+          <w:b/>
+          <w:bCs/>
+        </w:rPr>
+        <w:t xml:space="preserve">Unpublish</w:t>
+      </w:r>
+      <w:r>
+        <w:t xml:space="preserve">. A box asks "Unpublish this release?"</w:t>
       </w:r>
     </w:p>
     <w:p>
@@ -6239,166 +6499,6 @@
         <w:numPr>
           <w:ilvl w:val="0"/>
           <w:numId w:val="13"/>
-        </w:numPr>
-      </w:pPr>
-      <w:r>
-        <w:t xml:space="preserve">Choose </w:t>
-      </w:r>
-      <w:r>
-        <w:rPr>
-          <w:b/>
-          <w:bCs/>
-        </w:rPr>
-        <w:t xml:space="preserve">Change Top / Feature</w:t>
-      </w:r>
-      <w:r>
-        <w:t xml:space="preserve">. You see </w:t>
-      </w:r>
-      <w:r>
-        <w:rPr>
-          <w:b/>
-          <w:bCs/>
-        </w:rPr>
-        <w:t xml:space="preserve">Home</w:t>
-      </w:r>
-      <w:r>
-        <w:t xml:space="preserve"> and each ministry, sector and theme the release is filed under, as saved. One you have ticked in </w:t>
-      </w:r>
-      <w:r>
-        <w:rPr>
-          <w:b/>
-          <w:bCs/>
-        </w:rPr>
-        <w:t xml:space="preserve">Categories</w:t>
-      </w:r>
-      <w:r>
-        <w:t xml:space="preserve"> but not saved shows "Save to feature here." with no switch; choose </w:t>
-      </w:r>
-      <w:r>
-        <w:rPr>
-          <w:b/>
-          <w:bCs/>
-        </w:rPr>
-        <w:t xml:space="preserve">Save changes</w:t>
-      </w:r>
-      <w:r>
-        <w:t xml:space="preserve"> first.</w:t>
-      </w:r>
-    </w:p>
-    <w:p>
-      <w:pPr>
-        <w:pStyle w:val="ListParagraph"/>
-        <w:numPr>
-          <w:ilvl w:val="0"/>
-          <w:numId w:val="13"/>
-        </w:numPr>
-      </w:pPr>
-      <w:r>
-        <w:t xml:space="preserve">Switch </w:t>
-      </w:r>
-      <w:r>
-        <w:rPr>
-          <w:b/>
-          <w:bCs/>
-        </w:rPr>
-        <w:t xml:space="preserve">Top</w:t>
-      </w:r>
-      <w:r>
-        <w:t xml:space="preserve"> or </w:t>
-      </w:r>
-      <w:r>
-        <w:rPr>
-          <w:b/>
-          <w:bCs/>
-        </w:rPr>
-        <w:t xml:space="preserve">Feature</w:t>
-      </w:r>
-      <w:r>
-        <w:t xml:space="preserve"> on or off for a place.</w:t>
-      </w:r>
-    </w:p>
-    <w:p>
-      <w:pPr>
-        <w:spacing w:after="120"/>
-      </w:pPr>
-      <w:r>
-        <w:t xml:space="preserve">It changes at once, without </w:t>
-      </w:r>
-      <w:r>
-        <w:rPr>
-          <w:b/>
-          <w:bCs/>
-        </w:rPr>
-        <w:t xml:space="preserve">Save changes</w:t>
-      </w:r>
-      <w:r>
-        <w:t xml:space="preserve">, and doesn't republish the release or email anyone. Switching a spot on takes it over from whichever release had it. To see every spot at once, go to </w:t>
-      </w:r>
-      <w:r>
-        <w:rPr>
-          <w:b/>
-          <w:bCs/>
-        </w:rPr>
-        <w:t xml:space="preserve">Website</w:t>
-      </w:r>
-      <w:r>
-        <w:t xml:space="preserve"> &gt; </w:t>
-      </w:r>
-      <w:r>
-        <w:rPr>
-          <w:b/>
-          <w:bCs/>
-        </w:rPr>
-        <w:t xml:space="preserve">What's featured where</w:t>
-      </w:r>
-      <w:r>
-        <w:t xml:space="preserve">.</w:t>
-      </w:r>
-    </w:p>
-    <w:p>
-      <w:pPr>
-        <w:pStyle w:val="Heading2"/>
-      </w:pPr>
-      <w:r>
-        <w:t xml:space="preserve">Unpublish</w:t>
-      </w:r>
-    </w:p>
-    <w:p>
-      <w:pPr>
-        <w:spacing w:after="120"/>
-      </w:pPr>
-      <w:r>
-        <w:t xml:space="preserve">Advisories can't be unpublished.</w:t>
-      </w:r>
-    </w:p>
-    <w:p>
-      <w:pPr>
-        <w:pStyle w:val="ListParagraph"/>
-        <w:numPr>
-          <w:ilvl w:val="0"/>
-          <w:numId w:val="14"/>
-        </w:numPr>
-      </w:pPr>
-      <w:r>
-        <w:t xml:space="preserve">Choose </w:t>
-      </w:r>
-      <w:r>
-        <w:rPr>
-          <w:b/>
-          <w:bCs/>
-        </w:rPr>
-        <w:t xml:space="preserve">Unpublish</w:t>
-      </w:r>
-      <w:r>
-        <w:t xml:space="preserve">. A box asks "Unpublish this release?"</w:t>
-      </w:r>
-    </w:p>
-    <w:p>
-      <w:pPr>
-        <w:pStyle w:val="ListParagraph"/>
-        <w:numPr>
-          <w:ilvl w:val="0"/>
-          <w:numId w:val="14"/>
         </w:numPr>
       </w:pPr>
       <w:r>
@@ -6510,128 +6610,128 @@
         <w:pStyle w:val="ListParagraph"/>
         <w:numPr>
           <w:ilvl w:val="0"/>
+          <w:numId w:val="14"/>
+        </w:numPr>
+      </w:pPr>
+      <w:r>
+        <w:t xml:space="preserve">Choose </w:t>
+      </w:r>
+      <w:r>
+        <w:rPr>
+          <w:b/>
+          <w:bCs/>
+        </w:rPr>
+        <w:t xml:space="preserve">Delete</w:t>
+      </w:r>
+      <w:r>
+        <w:t xml:space="preserve">. A box asks "Delete this release?"</w:t>
+      </w:r>
+    </w:p>
+    <w:p>
+      <w:pPr>
+        <w:pStyle w:val="ListParagraph"/>
+        <w:numPr>
+          <w:ilvl w:val="0"/>
+          <w:numId w:val="14"/>
+        </w:numPr>
+      </w:pPr>
+      <w:r>
+        <w:t xml:space="preserve">Choose </w:t>
+      </w:r>
+      <w:r>
+        <w:rPr>
+          <w:b/>
+          <w:bCs/>
+        </w:rPr>
+        <w:t xml:space="preserve">Confirm delete</w:t>
+      </w:r>
+      <w:r>
+        <w:t xml:space="preserve">. You are taken to </w:t>
+      </w:r>
+      <w:r>
+        <w:rPr>
+          <w:b/>
+          <w:bCs/>
+        </w:rPr>
+        <w:t xml:space="preserve">Drafts</w:t>
+      </w:r>
+      <w:r>
+        <w:t xml:space="preserve">.</w:t>
+      </w:r>
+    </w:p>
+    <w:p>
+      <w:pPr>
+        <w:pStyle w:val="ListParagraph"/>
+        <w:numPr>
+          <w:ilvl w:val="0"/>
+          <w:numId w:val="1"/>
+        </w:numPr>
+      </w:pPr>
+      <w:r>
+        <w:t xml:space="preserve">A draft that was never approved is deleted for good: "This draft has never been approved — deleting it is permanent and can't be undone."</w:t>
+      </w:r>
+    </w:p>
+    <w:p>
+      <w:pPr>
+        <w:pStyle w:val="ListParagraph"/>
+        <w:numPr>
+          <w:ilvl w:val="0"/>
+          <w:numId w:val="1"/>
+        </w:numPr>
+      </w:pPr>
+      <w:r>
+        <w:t xml:space="preserve">A release with a reference number disappears from the folders and </w:t>
+      </w:r>
+      <w:r>
+        <w:rPr>
+          <w:b/>
+          <w:bCs/>
+        </w:rPr>
+        <w:t xml:space="preserve">Search</w:t>
+      </w:r>
+      <w:r>
+        <w:t xml:space="preserve">, but its record is kept: "This release has a reference number (NEWS-00010) — deleting it hides it from the lists but keeps the record."</w:t>
+      </w:r>
+    </w:p>
+    <w:p>
+      <w:pPr>
+        <w:pStyle w:val="Heading1"/>
+      </w:pPr>
+      <w:bookmarkStart w:name="section_9" w:id="9"/>
+      <w:r>
+        <w:t xml:space="preserve">Find a release</w:t>
+      </w:r>
+      <w:bookmarkEnd w:id="9"/>
+    </w:p>
+    <w:p>
+      <w:pPr>
+        <w:spacing w:after="120"/>
+      </w:pPr>
+      <w:r>
+        <w:rPr>
+          <w:b/>
+          <w:bCs/>
+        </w:rPr>
+        <w:t xml:space="preserve">Who this is for:</w:t>
+      </w:r>
+      <w:r>
+        <w:t xml:space="preserve"> Release editors (NRMS.Editor).</w:t>
+      </w:r>
+    </w:p>
+    <w:p>
+      <w:pPr>
+        <w:pStyle w:val="Heading2"/>
+      </w:pPr>
+      <w:r>
+        <w:t xml:space="preserve">Open a release you know</w:t>
+      </w:r>
+    </w:p>
+    <w:p>
+      <w:pPr>
+        <w:pStyle w:val="ListParagraph"/>
+        <w:numPr>
+          <w:ilvl w:val="0"/>
           <w:numId w:val="15"/>
-        </w:numPr>
-      </w:pPr>
-      <w:r>
-        <w:t xml:space="preserve">Choose </w:t>
-      </w:r>
-      <w:r>
-        <w:rPr>
-          <w:b/>
-          <w:bCs/>
-        </w:rPr>
-        <w:t xml:space="preserve">Delete</w:t>
-      </w:r>
-      <w:r>
-        <w:t xml:space="preserve">. A box asks "Delete this release?"</w:t>
-      </w:r>
-    </w:p>
-    <w:p>
-      <w:pPr>
-        <w:pStyle w:val="ListParagraph"/>
-        <w:numPr>
-          <w:ilvl w:val="0"/>
-          <w:numId w:val="15"/>
-        </w:numPr>
-      </w:pPr>
-      <w:r>
-        <w:t xml:space="preserve">Choose </w:t>
-      </w:r>
-      <w:r>
-        <w:rPr>
-          <w:b/>
-          <w:bCs/>
-        </w:rPr>
-        <w:t xml:space="preserve">Confirm delete</w:t>
-      </w:r>
-      <w:r>
-        <w:t xml:space="preserve">. You are taken to </w:t>
-      </w:r>
-      <w:r>
-        <w:rPr>
-          <w:b/>
-          <w:bCs/>
-        </w:rPr>
-        <w:t xml:space="preserve">Drafts</w:t>
-      </w:r>
-      <w:r>
-        <w:t xml:space="preserve">.</w:t>
-      </w:r>
-    </w:p>
-    <w:p>
-      <w:pPr>
-        <w:pStyle w:val="ListParagraph"/>
-        <w:numPr>
-          <w:ilvl w:val="0"/>
-          <w:numId w:val="1"/>
-        </w:numPr>
-      </w:pPr>
-      <w:r>
-        <w:t xml:space="preserve">A draft that was never approved is deleted for good: "This draft has never been approved — deleting it is permanent and can't be undone."</w:t>
-      </w:r>
-    </w:p>
-    <w:p>
-      <w:pPr>
-        <w:pStyle w:val="ListParagraph"/>
-        <w:numPr>
-          <w:ilvl w:val="0"/>
-          <w:numId w:val="1"/>
-        </w:numPr>
-      </w:pPr>
-      <w:r>
-        <w:t xml:space="preserve">A release with a reference number disappears from the folders and </w:t>
-      </w:r>
-      <w:r>
-        <w:rPr>
-          <w:b/>
-          <w:bCs/>
-        </w:rPr>
-        <w:t xml:space="preserve">Search</w:t>
-      </w:r>
-      <w:r>
-        <w:t xml:space="preserve">, but its record is kept: "This release has a reference number (NEWS-00010) — deleting it hides it from the lists but keeps the record."</w:t>
-      </w:r>
-    </w:p>
-    <w:p>
-      <w:pPr>
-        <w:pStyle w:val="Heading1"/>
-      </w:pPr>
-      <w:bookmarkStart w:name="section_9" w:id="9"/>
-      <w:r>
-        <w:t xml:space="preserve">Find a release</w:t>
-      </w:r>
-      <w:bookmarkEnd w:id="9"/>
-    </w:p>
-    <w:p>
-      <w:pPr>
-        <w:spacing w:after="120"/>
-      </w:pPr>
-      <w:r>
-        <w:rPr>
-          <w:b/>
-          <w:bCs/>
-        </w:rPr>
-        <w:t xml:space="preserve">Who this is for:</w:t>
-      </w:r>
-      <w:r>
-        <w:t xml:space="preserve"> Release editors (NRMS.Editor).</w:t>
-      </w:r>
-    </w:p>
-    <w:p>
-      <w:pPr>
-        <w:pStyle w:val="Heading2"/>
-      </w:pPr>
-      <w:r>
-        <w:t xml:space="preserve">Open a release you know</w:t>
-      </w:r>
-    </w:p>
-    <w:p>
-      <w:pPr>
-        <w:pStyle w:val="ListParagraph"/>
-        <w:numPr>
-          <w:ilvl w:val="0"/>
-          <w:numId w:val="16"/>
         </w:numPr>
       </w:pPr>
       <w:r>
@@ -6709,6 +6809,72 @@
         <w:pStyle w:val="ListParagraph"/>
         <w:numPr>
           <w:ilvl w:val="0"/>
+          <w:numId w:val="15"/>
+        </w:numPr>
+      </w:pPr>
+      <w:r>
+        <w:t xml:space="preserve">Choose </w:t>
+      </w:r>
+      <w:r>
+        <w:rPr>
+          <w:b/>
+          <w:bCs/>
+        </w:rPr>
+        <w:t xml:space="preserve">Find</w:t>
+      </w:r>
+      <w:r>
+        <w:t xml:space="preserve">.</w:t>
+      </w:r>
+    </w:p>
+    <w:p>
+      <w:pPr>
+        <w:spacing w:after="120"/>
+      </w:pPr>
+      <w:r>
+        <w:t xml:space="preserve">The release opens. If nothing has that number, you get </w:t>
+      </w:r>
+      <w:r>
+        <w:rPr>
+          <w:b/>
+          <w:bCs/>
+        </w:rPr>
+        <w:t xml:space="preserve">Search</w:t>
+      </w:r>
+      <w:r>
+        <w:t xml:space="preserve"> results for what you typed instead.</w:t>
+      </w:r>
+    </w:p>
+    <w:p>
+      <w:pPr>
+        <w:spacing w:after="120"/>
+      </w:pPr>
+      <w:r>
+        <w:t xml:space="preserve">On screens without their own search or filter box, Ctrl+K (Command+K on a Mac) takes you to </w:t>
+      </w:r>
+      <w:r>
+        <w:rPr>
+          <w:b/>
+          <w:bCs/>
+        </w:rPr>
+        <w:t xml:space="preserve">Find a release</w:t>
+      </w:r>
+      <w:r>
+        <w:t xml:space="preserve">.</w:t>
+      </w:r>
+    </w:p>
+    <w:p>
+      <w:pPr>
+        <w:pStyle w:val="Heading2"/>
+      </w:pPr>
+      <w:r>
+        <w:t xml:space="preserve">Search</w:t>
+      </w:r>
+    </w:p>
+    <w:p>
+      <w:pPr>
+        <w:pStyle w:val="ListParagraph"/>
+        <w:numPr>
+          <w:ilvl w:val="0"/>
           <w:numId w:val="16"/>
         </w:numPr>
       </w:pPr>
@@ -6720,7 +6886,143 @@
           <w:b/>
           <w:bCs/>
         </w:rPr>
-        <w:t xml:space="preserve">Find</w:t>
+        <w:t xml:space="preserve">Search</w:t>
+      </w:r>
+      <w:r>
+        <w:t xml:space="preserve"> in the side menu.</w:t>
+      </w:r>
+    </w:p>
+    <w:p>
+      <w:pPr>
+        <w:pStyle w:val="ListParagraph"/>
+        <w:numPr>
+          <w:ilvl w:val="0"/>
+          <w:numId w:val="16"/>
+        </w:numPr>
+      </w:pPr>
+      <w:r>
+        <w:t xml:space="preserve">Type part of the headline, exactly as it appears, in </w:t>
+      </w:r>
+      <w:r>
+        <w:rPr>
+          <w:b/>
+          <w:bCs/>
+        </w:rPr>
+        <w:t xml:space="preserve">Search</w:t>
+      </w:r>
+      <w:r>
+        <w:t xml:space="preserve">, or leave it empty and use the filters in step 3.</w:t>
+      </w:r>
+    </w:p>
+    <w:p>
+      <w:pPr>
+        <w:pStyle w:val="ListParagraph"/>
+        <w:numPr>
+          <w:ilvl w:val="0"/>
+          <w:numId w:val="16"/>
+        </w:numPr>
+      </w:pPr>
+      <w:r>
+        <w:t xml:space="preserve">To narrow it, choose a </w:t>
+      </w:r>
+      <w:r>
+        <w:rPr>
+          <w:b/>
+          <w:bCs/>
+        </w:rPr>
+        <w:t xml:space="preserve">Ministry</w:t>
+      </w:r>
+      <w:r>
+        <w:t xml:space="preserve">, </w:t>
+      </w:r>
+      <w:r>
+        <w:rPr>
+          <w:b/>
+          <w:bCs/>
+        </w:rPr>
+        <w:t xml:space="preserve">Sector</w:t>
+      </w:r>
+      <w:r>
+        <w:t xml:space="preserve"> or </w:t>
+      </w:r>
+      <w:r>
+        <w:rPr>
+          <w:b/>
+          <w:bCs/>
+        </w:rPr>
+        <w:t xml:space="preserve">Type</w:t>
+      </w:r>
+      <w:r>
+        <w:t xml:space="preserve">, or a </w:t>
+      </w:r>
+      <w:r>
+        <w:rPr>
+          <w:b/>
+          <w:bCs/>
+        </w:rPr>
+        <w:t xml:space="preserve">From</w:t>
+      </w:r>
+      <w:r>
+        <w:t xml:space="preserve"> and </w:t>
+      </w:r>
+      <w:r>
+        <w:rPr>
+          <w:b/>
+          <w:bCs/>
+        </w:rPr>
+        <w:t xml:space="preserve">To</w:t>
+      </w:r>
+      <w:r>
+        <w:t xml:space="preserve"> date. The dates are the release date: when it went out, or for one that hasn't, its planned or scheduled time. Both days are included; leave either empty for no limit on that side. If </w:t>
+      </w:r>
+      <w:r>
+        <w:rPr>
+          <w:b/>
+          <w:bCs/>
+        </w:rPr>
+        <w:t xml:space="preserve">From</w:t>
+      </w:r>
+      <w:r>
+        <w:t xml:space="preserve"> is after </w:t>
+      </w:r>
+      <w:r>
+        <w:rPr>
+          <w:b/>
+          <w:bCs/>
+        </w:rPr>
+        <w:t xml:space="preserve">To</w:t>
+      </w:r>
+      <w:r>
+        <w:t xml:space="preserve">, it says "The From date is after the To date." and doesn't search. They work on their own too: choose only a </w:t>
+      </w:r>
+      <w:r>
+        <w:rPr>
+          <w:b/>
+          <w:bCs/>
+        </w:rPr>
+        <w:t xml:space="preserve">Type</w:t>
+      </w:r>
+      <w:r>
+        <w:t xml:space="preserve"> and dates, for example, to list everything of that type from those days.</w:t>
+      </w:r>
+    </w:p>
+    <w:p>
+      <w:pPr>
+        <w:pStyle w:val="ListParagraph"/>
+        <w:numPr>
+          <w:ilvl w:val="0"/>
+          <w:numId w:val="16"/>
+        </w:numPr>
+      </w:pPr>
+      <w:r>
+        <w:t xml:space="preserve">Choose </w:t>
+      </w:r>
+      <w:r>
+        <w:rPr>
+          <w:b/>
+          <w:bCs/>
+        </w:rPr>
+        <w:t xml:space="preserve">Search</w:t>
       </w:r>
       <w:r>
         <w:t xml:space="preserve">.</w:t>
@@ -6731,7 +7033,25 @@
         <w:spacing w:after="120"/>
       </w:pPr>
       <w:r>
-        <w:t xml:space="preserve">The release opens. If nothing has that number, you get </w:t>
+        <w:t xml:space="preserve">Typing a reference number, key or web address here opens the release directly, as </w:t>
+      </w:r>
+      <w:r>
+        <w:rPr>
+          <w:b/>
+          <w:bCs/>
+        </w:rPr>
+        <w:t xml:space="preserve">Find a release</w:t>
+      </w:r>
+      <w:r>
+        <w:t xml:space="preserve"> does.</w:t>
+      </w:r>
+    </w:p>
+    <w:p>
+      <w:pPr>
+        <w:spacing w:after="120"/>
+      </w:pPr>
+      <w:r>
+        <w:t xml:space="preserve">Before you search, </w:t>
       </w:r>
       <w:r>
         <w:rPr>
@@ -6741,176 +7061,6 @@
         <w:t xml:space="preserve">Search</w:t>
       </w:r>
       <w:r>
-        <w:t xml:space="preserve"> results for what you typed instead.</w:t>
-      </w:r>
-    </w:p>
-    <w:p>
-      <w:pPr>
-        <w:spacing w:after="120"/>
-      </w:pPr>
-      <w:r>
-        <w:t xml:space="preserve">On screens without their own search or filter box, Ctrl+K (Command+K on a Mac) takes you to </w:t>
-      </w:r>
-      <w:r>
-        <w:rPr>
-          <w:b/>
-          <w:bCs/>
-        </w:rPr>
-        <w:t xml:space="preserve">Find a release</w:t>
-      </w:r>
-      <w:r>
-        <w:t xml:space="preserve">.</w:t>
-      </w:r>
-    </w:p>
-    <w:p>
-      <w:pPr>
-        <w:pStyle w:val="Heading2"/>
-      </w:pPr>
-      <w:r>
-        <w:t xml:space="preserve">Search</w:t>
-      </w:r>
-    </w:p>
-    <w:p>
-      <w:pPr>
-        <w:pStyle w:val="ListParagraph"/>
-        <w:numPr>
-          <w:ilvl w:val="0"/>
-          <w:numId w:val="17"/>
-        </w:numPr>
-      </w:pPr>
-      <w:r>
-        <w:t xml:space="preserve">Choose </w:t>
-      </w:r>
-      <w:r>
-        <w:rPr>
-          <w:b/>
-          <w:bCs/>
-        </w:rPr>
-        <w:t xml:space="preserve">Search</w:t>
-      </w:r>
-      <w:r>
-        <w:t xml:space="preserve"> in the side menu.</w:t>
-      </w:r>
-    </w:p>
-    <w:p>
-      <w:pPr>
-        <w:pStyle w:val="ListParagraph"/>
-        <w:numPr>
-          <w:ilvl w:val="0"/>
-          <w:numId w:val="17"/>
-        </w:numPr>
-      </w:pPr>
-      <w:r>
-        <w:t xml:space="preserve">Type part of the headline, exactly as it appears, in </w:t>
-      </w:r>
-      <w:r>
-        <w:rPr>
-          <w:b/>
-          <w:bCs/>
-        </w:rPr>
-        <w:t xml:space="preserve">Search</w:t>
-      </w:r>
-      <w:r>
-        <w:t xml:space="preserve">.</w:t>
-      </w:r>
-    </w:p>
-    <w:p>
-      <w:pPr>
-        <w:pStyle w:val="ListParagraph"/>
-        <w:numPr>
-          <w:ilvl w:val="0"/>
-          <w:numId w:val="17"/>
-        </w:numPr>
-      </w:pPr>
-      <w:r>
-        <w:t xml:space="preserve">To narrow it, choose a </w:t>
-      </w:r>
-      <w:r>
-        <w:rPr>
-          <w:b/>
-          <w:bCs/>
-        </w:rPr>
-        <w:t xml:space="preserve">Ministry</w:t>
-      </w:r>
-      <w:r>
-        <w:t xml:space="preserve"> or </w:t>
-      </w:r>
-      <w:r>
-        <w:rPr>
-          <w:b/>
-          <w:bCs/>
-        </w:rPr>
-        <w:t xml:space="preserve">Sector</w:t>
-      </w:r>
-      <w:r>
-        <w:t xml:space="preserve">. On its own, without words in </w:t>
-      </w:r>
-      <w:r>
-        <w:rPr>
-          <w:b/>
-          <w:bCs/>
-        </w:rPr>
-        <w:t xml:space="preserve">Search</w:t>
-      </w:r>
-      <w:r>
-        <w:t xml:space="preserve">, this does nothing.</w:t>
-      </w:r>
-    </w:p>
-    <w:p>
-      <w:pPr>
-        <w:pStyle w:val="ListParagraph"/>
-        <w:numPr>
-          <w:ilvl w:val="0"/>
-          <w:numId w:val="17"/>
-        </w:numPr>
-      </w:pPr>
-      <w:r>
-        <w:t xml:space="preserve">Choose </w:t>
-      </w:r>
-      <w:r>
-        <w:rPr>
-          <w:b/>
-          <w:bCs/>
-        </w:rPr>
-        <w:t xml:space="preserve">Search</w:t>
-      </w:r>
-      <w:r>
-        <w:t xml:space="preserve">.</w:t>
-      </w:r>
-    </w:p>
-    <w:p>
-      <w:pPr>
-        <w:spacing w:after="120"/>
-      </w:pPr>
-      <w:r>
-        <w:t xml:space="preserve">Typing a reference number, key or web address here opens the release directly, as </w:t>
-      </w:r>
-      <w:r>
-        <w:rPr>
-          <w:b/>
-          <w:bCs/>
-        </w:rPr>
-        <w:t xml:space="preserve">Find a release</w:t>
-      </w:r>
-      <w:r>
-        <w:t xml:space="preserve"> does.</w:t>
-      </w:r>
-    </w:p>
-    <w:p>
-      <w:pPr>
-        <w:spacing w:after="120"/>
-      </w:pPr>
-      <w:r>
-        <w:t xml:space="preserve">Before you search, </w:t>
-      </w:r>
-      <w:r>
-        <w:rPr>
-          <w:b/>
-          <w:bCs/>
-        </w:rPr>
-        <w:t xml:space="preserve">Search</w:t>
-      </w:r>
-      <w:r>
         <w:t xml:space="preserve"> lists the five most recently published releases.</w:t>
       </w:r>
     </w:p>
@@ -6919,14 +7069,14 @@
         <w:spacing w:after="120"/>
       </w:pPr>
       <w:r>
-        <w:t xml:space="preserve">Results include drafts, scheduled and published releases, newest first, 20 to a page. Deleted releases don't appear. If nothing matches, you see "No releases match" and your words; if a ministry or sector is chosen, choose </w:t>
-      </w:r>
-      <w:r>
-        <w:rPr>
-          <w:b/>
-          <w:bCs/>
-        </w:rPr>
-        <w:t xml:space="preserve">Clear ministry and sector filters</w:t>
+        <w:t xml:space="preserve">Results include drafts, scheduled and published releases, newest first, 20 to a page. Deleted releases don't appear. If nothing matches, you see "No releases match" and your words; if any filter is chosen, choose </w:t>
+      </w:r>
+      <w:r>
+        <w:rPr>
+          <w:b/>
+          <w:bCs/>
+        </w:rPr>
+        <w:t xml:space="preserve">Clear filters</w:t>
       </w:r>
       <w:r>
         <w:t xml:space="preserve"> to try again without them.</w:t>
@@ -8044,21 +8194,6 @@
     </w:lvlOverride>
   </w:num>
   <w:num w:numId="16">
-    <w:abstractNumId w:val="3"/>
-    <w:lvlOverride w:ilvl="0">
-      <w:startOverride w:val="1"/>
-    </w:lvlOverride>
-    <w:lvlOverride w:ilvl="1">
-      <w:startOverride w:val="1"/>
-    </w:lvlOverride>
-    <w:lvlOverride w:ilvl="2">
-      <w:startOverride w:val="1"/>
-    </w:lvlOverride>
-    <w:lvlOverride w:ilvl="3">
-      <w:startOverride w:val="1"/>
-    </w:lvlOverride>
-  </w:num>
-  <w:num w:numId="17">
     <w:abstractNumId w:val="3"/>
     <w:lvlOverride w:ilvl="0">
       <w:startOverride w:val="1"/>

</xml_diff>